<commit_message>
docs: add reduced-compute option for national 2m embeddings
</commit_message>
<xml_diff>
--- a/docs/plans/word/china_alphaearth_high_resolution_quarterly_2020_2021_20260721_zh.docx
+++ b/docs/plans/word/china_alphaearth_high_resolution_quarterly_2020_2021_20260721_zh.docx
@@ -74,7 +74,7 @@
           <w:color w:val="000000"/>
           <w:sz w:val="24"/>
         </w:rPr>
-        <w:t>计划交付时间：启动后约 120--150 天。</w:t>
+        <w:t>计划交付时间：Option 1 启动后约 120--150 天；Option 2 启动后约 90--120 天。</w:t>
       </w:r>
     </w:p>
     <w:p>
@@ -104,7 +104,7 @@
           <w:color w:val="000000"/>
           <w:sz w:val="28"/>
         </w:rPr>
-        <w:t>1. 显存和算力</w:t>
+        <w:t>1. Option 1：全部按照 2 米分辨率训练和导出</w:t>
       </w:r>
     </w:p>
     <w:p>
@@ -734,7 +734,869 @@
           <w:color w:val="000000"/>
           <w:sz w:val="28"/>
         </w:rPr>
-        <w:t>2. 磁盘存储</w:t>
+        <w:t>2. Option 2：10 米语义主干加 2 米轻量细节分支</w:t>
+      </w:r>
+    </w:p>
+    <w:p>
+      <w:r>
+        <w:rPr>
+          <w:rFonts w:ascii="Times New Roman" w:hAnsi="Times New Roman" w:cs="Times New Roman" w:eastAsia="宋体"/>
+          <w:color w:val="000000"/>
+          <w:sz w:val="24"/>
+        </w:rPr>
+        <w:t>Option 1 的 320 张卡是按照训练和导出都随 2 米像素数量完整放大 25 倍估算的。实际建设可以复用已经训练好的 10 米语义主干，只增加一个计算量较小的 2 米细节分支。</w:t>
+      </w:r>
+    </w:p>
+    <w:p>
+      <w:r>
+        <w:rPr>
+          <w:rFonts w:ascii="Times New Roman" w:hAnsi="Times New Roman" w:cs="Times New Roman" w:eastAsia="宋体"/>
+          <w:color w:val="000000"/>
+          <w:sz w:val="24"/>
+        </w:rPr>
+        <w:t>Option 2 仍然输出全国真实 2 米、64 维嵌入。每个 2 米像素都读取高分辨率影像并生成独立向量，不是把 10 米结果直接插值放大。</w:t>
+      </w:r>
+    </w:p>
+    <w:p>
+      <w:r>
+        <w:rPr>
+          <w:rFonts w:ascii="Times New Roman" w:hAnsi="Times New Roman" w:cs="Times New Roman" w:eastAsia="宋体"/>
+          <w:color w:val="000000"/>
+          <w:sz w:val="24"/>
+        </w:rPr>
+        <w:t>具体做法如下。</w:t>
+      </w:r>
+    </w:p>
+    <w:p>
+      <w:r>
+        <w:rPr>
+          <w:rFonts w:ascii="Times New Roman" w:hAnsi="Times New Roman" w:cs="Times New Roman" w:eastAsia="宋体"/>
+          <w:color w:val="000000"/>
+          <w:sz w:val="24"/>
+        </w:rPr>
+        <w:t>1、10 米主干负责土地覆盖、植被、水体、城市和季度变化等主要语义。主干使用已有全国模型初始化，第一阶段冻结参数，后期只解冻最后一到两层。</w:t>
+      </w:r>
+    </w:p>
+    <w:p>
+      <w:r>
+        <w:rPr>
+          <w:rFonts w:ascii="Times New Roman" w:hAnsi="Times New Roman" w:cs="Times New Roman" w:eastAsia="宋体"/>
+          <w:color w:val="000000"/>
+          <w:sz w:val="24"/>
+        </w:rPr>
+        <w:t>2、2 米分支只处理高分辨率光学影像，使用深度可分离卷积和轻量 MLP 解码器，学习道路、建筑、岸线、田块和小型地物的边界细节。</w:t>
+      </w:r>
+    </w:p>
+    <w:p>
+      <w:r>
+        <w:rPr>
+          <w:rFonts w:ascii="Times New Roman" w:hAnsi="Times New Roman" w:cs="Times New Roman" w:eastAsia="宋体"/>
+          <w:color w:val="000000"/>
+          <w:sz w:val="24"/>
+        </w:rPr>
+        <w:t>3、2 米分支输出对 10 米嵌入的细节修正量。最终 64 维向量由 10 米语义向量和 2 米细节修正量共同生成。</w:t>
+      </w:r>
+    </w:p>
+    <w:p>
+      <w:r>
+        <w:rPr>
+          <w:rFonts w:ascii="Times New Roman" w:hAnsi="Times New Roman" w:cs="Times New Roman" w:eastAsia="宋体"/>
+          <w:color w:val="000000"/>
+          <w:sz w:val="24"/>
+        </w:rPr>
+        <w:t>4、训练时从 62,000 个位置的 25 个高分子块中随机抽取，不要求每个 epoch 遍历全部子块。经过多个 epoch 后逐步覆盖不同地区、季度和地物。</w:t>
+      </w:r>
+    </w:p>
+    <w:p>
+      <w:r>
+        <w:rPr>
+          <w:rFonts w:ascii="Times New Roman" w:hAnsi="Times New Roman" w:cs="Times New Roman" w:eastAsia="宋体"/>
+          <w:color w:val="000000"/>
+          <w:sz w:val="24"/>
+        </w:rPr>
+        <w:t>5、使用教师学生训练。10 米模型提供稳定语义，高分辨率重建和边界损失负责细节，避免轻量分支只学习纹理而丢失语义。</w:t>
+      </w:r>
+    </w:p>
+    <w:p>
+      <w:r>
+        <w:rPr>
+          <w:rFonts w:ascii="Times New Roman" w:hAnsi="Times New Roman" w:cs="Times New Roman" w:eastAsia="宋体"/>
+          <w:color w:val="000000"/>
+          <w:sz w:val="24"/>
+        </w:rPr>
+        <w:t xml:space="preserve">6、全国导出时，同一个 </w:t>
+      </w:r>
+      <w:r>
+        <w:rPr>
+          <w:rFonts w:ascii="Times New Roman" w:hAnsi="Times New Roman" w:cs="Times New Roman" w:eastAsia="宋体"/>
+          <w:color w:val="000000"/>
+          <w:sz w:val="24"/>
+        </w:rPr>
+        <w:t>1,280 m x 1,280 m</w:t>
+      </w:r>
+      <w:r>
+        <w:rPr>
+          <w:rFonts w:ascii="Times New Roman" w:hAnsi="Times New Roman" w:cs="Times New Roman" w:eastAsia="宋体"/>
+          <w:color w:val="000000"/>
+          <w:sz w:val="24"/>
+        </w:rPr>
+        <w:t xml:space="preserve"> 位置的 10 米主干只计算一次，25 个 2 米子块共享主干结果。细节分支使用 BF16 计算和 int8 输出，并采用大分片顺序写入。</w:t>
+      </w:r>
+    </w:p>
+    <w:tbl>
+      <w:tblPr>
+        <w:tblStyle w:val="TableGrid"/>
+        <w:tblW w:type="auto" w:w="0"/>
+        <w:jc w:val="center"/>
+        <w:tblLayout w:type="autofit"/>
+        <w:tblLook w:firstColumn="1" w:firstRow="1" w:lastColumn="0" w:lastRow="0" w:noHBand="0" w:noVBand="1" w:val="04A0"/>
+      </w:tblPr>
+      <w:tblGrid>
+        <w:gridCol w:w="3286"/>
+        <w:gridCol w:w="3286"/>
+        <w:gridCol w:w="3286"/>
+      </w:tblGrid>
+      <w:tr>
+        <w:tc>
+          <w:tcPr>
+            <w:tcW w:type="dxa" w:w="3286"/>
+            <w:vAlign w:val="center"/>
+          </w:tcPr>
+          <w:p>
+            <w:pPr>
+              <w:jc w:val="center"/>
+            </w:pPr>
+            <w:r>
+              <w:rPr>
+                <w:rFonts w:ascii="Times New Roman" w:hAnsi="Times New Roman" w:cs="Times New Roman" w:eastAsia="宋体"/>
+                <w:b/>
+                <w:color w:val="000000"/>
+                <w:sz w:val="24"/>
+              </w:rPr>
+            </w:r>
+            <w:r>
+              <w:rPr>
+                <w:rFonts w:ascii="Times New Roman" w:hAnsi="Times New Roman" w:cs="Times New Roman" w:eastAsia="宋体"/>
+                <w:b/>
+                <w:color w:val="000000"/>
+                <w:sz w:val="24"/>
+              </w:rPr>
+              <w:t>项目</w:t>
+            </w:r>
+          </w:p>
+        </w:tc>
+        <w:tc>
+          <w:tcPr>
+            <w:tcW w:type="dxa" w:w="3286"/>
+            <w:vAlign w:val="center"/>
+          </w:tcPr>
+          <w:p>
+            <w:pPr>
+              <w:jc w:val="center"/>
+            </w:pPr>
+            <w:r>
+              <w:rPr>
+                <w:rFonts w:ascii="Times New Roman" w:hAnsi="Times New Roman" w:cs="Times New Roman" w:eastAsia="宋体"/>
+                <w:b/>
+                <w:color w:val="000000"/>
+                <w:sz w:val="24"/>
+              </w:rPr>
+            </w:r>
+            <w:r>
+              <w:rPr>
+                <w:rFonts w:ascii="Times New Roman" w:hAnsi="Times New Roman" w:cs="Times New Roman" w:eastAsia="宋体"/>
+                <w:b/>
+                <w:color w:val="000000"/>
+                <w:sz w:val="24"/>
+              </w:rPr>
+              <w:t>最低配置</w:t>
+            </w:r>
+          </w:p>
+        </w:tc>
+        <w:tc>
+          <w:tcPr>
+            <w:tcW w:type="dxa" w:w="3286"/>
+            <w:vAlign w:val="center"/>
+          </w:tcPr>
+          <w:p>
+            <w:pPr>
+              <w:jc w:val="center"/>
+            </w:pPr>
+            <w:r>
+              <w:rPr>
+                <w:rFonts w:ascii="Times New Roman" w:hAnsi="Times New Roman" w:cs="Times New Roman" w:eastAsia="宋体"/>
+                <w:b/>
+                <w:color w:val="000000"/>
+                <w:sz w:val="24"/>
+              </w:rPr>
+            </w:r>
+            <w:r>
+              <w:rPr>
+                <w:rFonts w:ascii="Times New Roman" w:hAnsi="Times New Roman" w:cs="Times New Roman" w:eastAsia="宋体"/>
+                <w:b/>
+                <w:color w:val="000000"/>
+                <w:sz w:val="24"/>
+              </w:rPr>
+              <w:t>建议配置</w:t>
+            </w:r>
+          </w:p>
+        </w:tc>
+      </w:tr>
+      <w:tr>
+        <w:tc>
+          <w:tcPr>
+            <w:tcW w:type="dxa" w:w="3286"/>
+            <w:vAlign w:val="center"/>
+          </w:tcPr>
+          <w:p>
+            <w:pPr>
+              <w:jc w:val="center"/>
+            </w:pPr>
+            <w:r>
+              <w:rPr>
+                <w:rFonts w:ascii="Times New Roman" w:hAnsi="Times New Roman" w:cs="Times New Roman" w:eastAsia="宋体"/>
+                <w:color w:val="000000"/>
+                <w:sz w:val="24"/>
+              </w:rPr>
+            </w:r>
+            <w:r>
+              <w:rPr>
+                <w:rFonts w:ascii="Times New Roman" w:hAnsi="Times New Roman" w:cs="Times New Roman" w:eastAsia="宋体"/>
+                <w:color w:val="000000"/>
+                <w:sz w:val="24"/>
+              </w:rPr>
+              <w:t>Ascend 910B 数量</w:t>
+            </w:r>
+          </w:p>
+        </w:tc>
+        <w:tc>
+          <w:tcPr>
+            <w:tcW w:type="dxa" w:w="3286"/>
+            <w:vAlign w:val="center"/>
+          </w:tcPr>
+          <w:p>
+            <w:pPr>
+              <w:jc w:val="center"/>
+            </w:pPr>
+            <w:r>
+              <w:rPr>
+                <w:rFonts w:ascii="Times New Roman" w:hAnsi="Times New Roman" w:cs="Times New Roman" w:eastAsia="宋体"/>
+                <w:color w:val="000000"/>
+                <w:sz w:val="24"/>
+              </w:rPr>
+            </w:r>
+            <w:r>
+              <w:rPr>
+                <w:rFonts w:ascii="Times New Roman" w:hAnsi="Times New Roman" w:cs="Times New Roman" w:eastAsia="宋体"/>
+                <w:color w:val="000000"/>
+                <w:sz w:val="24"/>
+              </w:rPr>
+              <w:t>64 张</w:t>
+            </w:r>
+          </w:p>
+        </w:tc>
+        <w:tc>
+          <w:tcPr>
+            <w:tcW w:type="dxa" w:w="3286"/>
+            <w:vAlign w:val="center"/>
+          </w:tcPr>
+          <w:p>
+            <w:pPr>
+              <w:jc w:val="center"/>
+            </w:pPr>
+            <w:r>
+              <w:rPr>
+                <w:rFonts w:ascii="Times New Roman" w:hAnsi="Times New Roman" w:cs="Times New Roman" w:eastAsia="宋体"/>
+                <w:color w:val="000000"/>
+                <w:sz w:val="24"/>
+              </w:rPr>
+            </w:r>
+            <w:r>
+              <w:rPr>
+                <w:rFonts w:ascii="Times New Roman" w:hAnsi="Times New Roman" w:cs="Times New Roman" w:eastAsia="宋体"/>
+                <w:color w:val="000000"/>
+                <w:sz w:val="24"/>
+              </w:rPr>
+              <w:t>96--128 张</w:t>
+            </w:r>
+          </w:p>
+        </w:tc>
+      </w:tr>
+      <w:tr>
+        <w:tc>
+          <w:tcPr>
+            <w:tcW w:type="dxa" w:w="3286"/>
+            <w:vAlign w:val="center"/>
+          </w:tcPr>
+          <w:p>
+            <w:pPr>
+              <w:jc w:val="center"/>
+            </w:pPr>
+            <w:r>
+              <w:rPr>
+                <w:rFonts w:ascii="Times New Roman" w:hAnsi="Times New Roman" w:cs="Times New Roman" w:eastAsia="宋体"/>
+                <w:color w:val="000000"/>
+                <w:sz w:val="24"/>
+              </w:rPr>
+            </w:r>
+            <w:r>
+              <w:rPr>
+                <w:rFonts w:ascii="Times New Roman" w:hAnsi="Times New Roman" w:cs="Times New Roman" w:eastAsia="宋体"/>
+                <w:color w:val="000000"/>
+                <w:sz w:val="24"/>
+              </w:rPr>
+              <w:t>总物理显存</w:t>
+            </w:r>
+          </w:p>
+        </w:tc>
+        <w:tc>
+          <w:tcPr>
+            <w:tcW w:type="dxa" w:w="3286"/>
+            <w:vAlign w:val="center"/>
+          </w:tcPr>
+          <w:p>
+            <w:pPr>
+              <w:jc w:val="center"/>
+            </w:pPr>
+            <w:r>
+              <w:rPr>
+                <w:rFonts w:ascii="Times New Roman" w:hAnsi="Times New Roman" w:cs="Times New Roman" w:eastAsia="宋体"/>
+                <w:color w:val="000000"/>
+                <w:sz w:val="24"/>
+              </w:rPr>
+            </w:r>
+            <w:r>
+              <w:rPr>
+                <w:rFonts w:ascii="Times New Roman" w:hAnsi="Times New Roman" w:cs="Times New Roman" w:eastAsia="宋体"/>
+                <w:color w:val="000000"/>
+                <w:sz w:val="24"/>
+              </w:rPr>
+              <w:t>4 TB</w:t>
+            </w:r>
+          </w:p>
+        </w:tc>
+        <w:tc>
+          <w:tcPr>
+            <w:tcW w:type="dxa" w:w="3286"/>
+            <w:vAlign w:val="center"/>
+          </w:tcPr>
+          <w:p>
+            <w:pPr>
+              <w:jc w:val="center"/>
+            </w:pPr>
+            <w:r>
+              <w:rPr>
+                <w:rFonts w:ascii="Times New Roman" w:hAnsi="Times New Roman" w:cs="Times New Roman" w:eastAsia="宋体"/>
+                <w:color w:val="000000"/>
+                <w:sz w:val="24"/>
+              </w:rPr>
+            </w:r>
+            <w:r>
+              <w:rPr>
+                <w:rFonts w:ascii="Times New Roman" w:hAnsi="Times New Roman" w:cs="Times New Roman" w:eastAsia="宋体"/>
+                <w:color w:val="000000"/>
+                <w:sz w:val="24"/>
+              </w:rPr>
+              <w:t>6--8 TB</w:t>
+            </w:r>
+          </w:p>
+        </w:tc>
+      </w:tr>
+      <w:tr>
+        <w:tc>
+          <w:tcPr>
+            <w:tcW w:type="dxa" w:w="3286"/>
+            <w:vAlign w:val="center"/>
+          </w:tcPr>
+          <w:p>
+            <w:pPr>
+              <w:jc w:val="center"/>
+            </w:pPr>
+            <w:r>
+              <w:rPr>
+                <w:rFonts w:ascii="Times New Roman" w:hAnsi="Times New Roman" w:cs="Times New Roman" w:eastAsia="宋体"/>
+                <w:color w:val="000000"/>
+                <w:sz w:val="24"/>
+              </w:rPr>
+            </w:r>
+            <w:r>
+              <w:rPr>
+                <w:rFonts w:ascii="Times New Roman" w:hAnsi="Times New Roman" w:cs="Times New Roman" w:eastAsia="宋体"/>
+                <w:color w:val="000000"/>
+                <w:sz w:val="24"/>
+              </w:rPr>
+              <w:t>轻量分支训练时间</w:t>
+            </w:r>
+          </w:p>
+        </w:tc>
+        <w:tc>
+          <w:tcPr>
+            <w:tcW w:type="dxa" w:w="3286"/>
+            <w:vAlign w:val="center"/>
+          </w:tcPr>
+          <w:p>
+            <w:pPr>
+              <w:jc w:val="center"/>
+            </w:pPr>
+            <w:r>
+              <w:rPr>
+                <w:rFonts w:ascii="Times New Roman" w:hAnsi="Times New Roman" w:cs="Times New Roman" w:eastAsia="宋体"/>
+                <w:color w:val="000000"/>
+                <w:sz w:val="24"/>
+              </w:rPr>
+            </w:r>
+            <w:r>
+              <w:rPr>
+                <w:rFonts w:ascii="Times New Roman" w:hAnsi="Times New Roman" w:cs="Times New Roman" w:eastAsia="宋体"/>
+                <w:color w:val="000000"/>
+                <w:sz w:val="24"/>
+              </w:rPr>
+              <w:t>35--50 天</w:t>
+            </w:r>
+          </w:p>
+        </w:tc>
+        <w:tc>
+          <w:tcPr>
+            <w:tcW w:type="dxa" w:w="3286"/>
+            <w:vAlign w:val="center"/>
+          </w:tcPr>
+          <w:p>
+            <w:pPr>
+              <w:jc w:val="center"/>
+            </w:pPr>
+            <w:r>
+              <w:rPr>
+                <w:rFonts w:ascii="Times New Roman" w:hAnsi="Times New Roman" w:cs="Times New Roman" w:eastAsia="宋体"/>
+                <w:color w:val="000000"/>
+                <w:sz w:val="24"/>
+              </w:rPr>
+            </w:r>
+            <w:r>
+              <w:rPr>
+                <w:rFonts w:ascii="Times New Roman" w:hAnsi="Times New Roman" w:cs="Times New Roman" w:eastAsia="宋体"/>
+                <w:color w:val="000000"/>
+                <w:sz w:val="24"/>
+              </w:rPr>
+              <w:t>25--35 天</w:t>
+            </w:r>
+          </w:p>
+        </w:tc>
+      </w:tr>
+      <w:tr>
+        <w:tc>
+          <w:tcPr>
+            <w:tcW w:type="dxa" w:w="3286"/>
+            <w:vAlign w:val="center"/>
+          </w:tcPr>
+          <w:p>
+            <w:pPr>
+              <w:jc w:val="center"/>
+            </w:pPr>
+            <w:r>
+              <w:rPr>
+                <w:rFonts w:ascii="Times New Roman" w:hAnsi="Times New Roman" w:cs="Times New Roman" w:eastAsia="宋体"/>
+                <w:color w:val="000000"/>
+                <w:sz w:val="24"/>
+              </w:rPr>
+            </w:r>
+            <w:r>
+              <w:rPr>
+                <w:rFonts w:ascii="Times New Roman" w:hAnsi="Times New Roman" w:cs="Times New Roman" w:eastAsia="宋体"/>
+                <w:color w:val="000000"/>
+                <w:sz w:val="24"/>
+              </w:rPr>
+              <w:t>8 期全国导出时间</w:t>
+            </w:r>
+          </w:p>
+        </w:tc>
+        <w:tc>
+          <w:tcPr>
+            <w:tcW w:type="dxa" w:w="3286"/>
+            <w:vAlign w:val="center"/>
+          </w:tcPr>
+          <w:p>
+            <w:pPr>
+              <w:jc w:val="center"/>
+            </w:pPr>
+            <w:r>
+              <w:rPr>
+                <w:rFonts w:ascii="Times New Roman" w:hAnsi="Times New Roman" w:cs="Times New Roman" w:eastAsia="宋体"/>
+                <w:color w:val="000000"/>
+                <w:sz w:val="24"/>
+              </w:rPr>
+            </w:r>
+            <w:r>
+              <w:rPr>
+                <w:rFonts w:ascii="Times New Roman" w:hAnsi="Times New Roman" w:cs="Times New Roman" w:eastAsia="宋体"/>
+                <w:color w:val="000000"/>
+                <w:sz w:val="24"/>
+              </w:rPr>
+              <w:t>35--50 天</w:t>
+            </w:r>
+          </w:p>
+        </w:tc>
+        <w:tc>
+          <w:tcPr>
+            <w:tcW w:type="dxa" w:w="3286"/>
+            <w:vAlign w:val="center"/>
+          </w:tcPr>
+          <w:p>
+            <w:pPr>
+              <w:jc w:val="center"/>
+            </w:pPr>
+            <w:r>
+              <w:rPr>
+                <w:rFonts w:ascii="Times New Roman" w:hAnsi="Times New Roman" w:cs="Times New Roman" w:eastAsia="宋体"/>
+                <w:color w:val="000000"/>
+                <w:sz w:val="24"/>
+              </w:rPr>
+            </w:r>
+            <w:r>
+              <w:rPr>
+                <w:rFonts w:ascii="Times New Roman" w:hAnsi="Times New Roman" w:cs="Times New Roman" w:eastAsia="宋体"/>
+                <w:color w:val="000000"/>
+                <w:sz w:val="24"/>
+              </w:rPr>
+              <w:t>25--35 天</w:t>
+            </w:r>
+          </w:p>
+        </w:tc>
+      </w:tr>
+      <w:tr>
+        <w:tc>
+          <w:tcPr>
+            <w:tcW w:type="dxa" w:w="3286"/>
+            <w:vAlign w:val="center"/>
+          </w:tcPr>
+          <w:p>
+            <w:pPr>
+              <w:jc w:val="center"/>
+            </w:pPr>
+            <w:r>
+              <w:rPr>
+                <w:rFonts w:ascii="Times New Roman" w:hAnsi="Times New Roman" w:cs="Times New Roman" w:eastAsia="宋体"/>
+                <w:color w:val="000000"/>
+                <w:sz w:val="24"/>
+              </w:rPr>
+            </w:r>
+            <w:r>
+              <w:rPr>
+                <w:rFonts w:ascii="Times New Roman" w:hAnsi="Times New Roman" w:cs="Times New Roman" w:eastAsia="宋体"/>
+                <w:color w:val="000000"/>
+                <w:sz w:val="24"/>
+              </w:rPr>
+              <w:t>数据检查、测试和机动时间</w:t>
+            </w:r>
+          </w:p>
+        </w:tc>
+        <w:tc>
+          <w:tcPr>
+            <w:tcW w:type="dxa" w:w="3286"/>
+            <w:vAlign w:val="center"/>
+          </w:tcPr>
+          <w:p>
+            <w:pPr>
+              <w:jc w:val="center"/>
+            </w:pPr>
+            <w:r>
+              <w:rPr>
+                <w:rFonts w:ascii="Times New Roman" w:hAnsi="Times New Roman" w:cs="Times New Roman" w:eastAsia="宋体"/>
+                <w:color w:val="000000"/>
+                <w:sz w:val="24"/>
+              </w:rPr>
+            </w:r>
+            <w:r>
+              <w:rPr>
+                <w:rFonts w:ascii="Times New Roman" w:hAnsi="Times New Roman" w:cs="Times New Roman" w:eastAsia="宋体"/>
+                <w:color w:val="000000"/>
+                <w:sz w:val="24"/>
+              </w:rPr>
+              <w:t>30--40 天</w:t>
+            </w:r>
+          </w:p>
+        </w:tc>
+        <w:tc>
+          <w:tcPr>
+            <w:tcW w:type="dxa" w:w="3286"/>
+            <w:vAlign w:val="center"/>
+          </w:tcPr>
+          <w:p>
+            <w:pPr>
+              <w:jc w:val="center"/>
+            </w:pPr>
+            <w:r>
+              <w:rPr>
+                <w:rFonts w:ascii="Times New Roman" w:hAnsi="Times New Roman" w:cs="Times New Roman" w:eastAsia="宋体"/>
+                <w:color w:val="000000"/>
+                <w:sz w:val="24"/>
+              </w:rPr>
+            </w:r>
+            <w:r>
+              <w:rPr>
+                <w:rFonts w:ascii="Times New Roman" w:hAnsi="Times New Roman" w:cs="Times New Roman" w:eastAsia="宋体"/>
+                <w:color w:val="000000"/>
+                <w:sz w:val="24"/>
+              </w:rPr>
+              <w:t>30--40 天</w:t>
+            </w:r>
+          </w:p>
+        </w:tc>
+      </w:tr>
+      <w:tr>
+        <w:tc>
+          <w:tcPr>
+            <w:tcW w:type="dxa" w:w="3286"/>
+            <w:vAlign w:val="center"/>
+          </w:tcPr>
+          <w:p>
+            <w:pPr>
+              <w:jc w:val="center"/>
+            </w:pPr>
+            <w:r>
+              <w:rPr>
+                <w:rFonts w:ascii="Times New Roman" w:hAnsi="Times New Roman" w:cs="Times New Roman" w:eastAsia="宋体"/>
+                <w:color w:val="000000"/>
+                <w:sz w:val="24"/>
+              </w:rPr>
+            </w:r>
+            <w:r>
+              <w:rPr>
+                <w:rFonts w:ascii="Times New Roman" w:hAnsi="Times New Roman" w:cs="Times New Roman" w:eastAsia="宋体"/>
+                <w:color w:val="000000"/>
+                <w:sz w:val="24"/>
+              </w:rPr>
+              <w:t>项目总工期</w:t>
+            </w:r>
+          </w:p>
+        </w:tc>
+        <w:tc>
+          <w:tcPr>
+            <w:tcW w:type="dxa" w:w="3286"/>
+            <w:vAlign w:val="center"/>
+          </w:tcPr>
+          <w:p>
+            <w:pPr>
+              <w:jc w:val="center"/>
+            </w:pPr>
+            <w:r>
+              <w:rPr>
+                <w:rFonts w:ascii="Times New Roman" w:hAnsi="Times New Roman" w:cs="Times New Roman" w:eastAsia="宋体"/>
+                <w:color w:val="000000"/>
+                <w:sz w:val="24"/>
+              </w:rPr>
+            </w:r>
+            <w:r>
+              <w:rPr>
+                <w:rFonts w:ascii="Times New Roman" w:hAnsi="Times New Roman" w:cs="Times New Roman" w:eastAsia="宋体"/>
+                <w:color w:val="000000"/>
+                <w:sz w:val="24"/>
+              </w:rPr>
+              <w:t>约 110--140 天</w:t>
+            </w:r>
+          </w:p>
+        </w:tc>
+        <w:tc>
+          <w:tcPr>
+            <w:tcW w:type="dxa" w:w="3286"/>
+            <w:vAlign w:val="center"/>
+          </w:tcPr>
+          <w:p>
+            <w:pPr>
+              <w:jc w:val="center"/>
+            </w:pPr>
+            <w:r>
+              <w:rPr>
+                <w:rFonts w:ascii="Times New Roman" w:hAnsi="Times New Roman" w:cs="Times New Roman" w:eastAsia="宋体"/>
+                <w:color w:val="000000"/>
+                <w:sz w:val="24"/>
+              </w:rPr>
+            </w:r>
+            <w:r>
+              <w:rPr>
+                <w:rFonts w:ascii="Times New Roman" w:hAnsi="Times New Roman" w:cs="Times New Roman" w:eastAsia="宋体"/>
+                <w:color w:val="000000"/>
+                <w:sz w:val="24"/>
+              </w:rPr>
+              <w:t>约 90--120 天</w:t>
+            </w:r>
+          </w:p>
+        </w:tc>
+      </w:tr>
+    </w:tbl>
+    <w:p>
+      <w:pPr>
+        <w:spacing w:after="0"/>
+      </w:pPr>
+    </w:p>
+    <w:p>
+      <w:r>
+        <w:rPr>
+          <w:rFonts w:ascii="Times New Roman" w:hAnsi="Times New Roman" w:cs="Times New Roman" w:eastAsia="宋体"/>
+          <w:color w:val="000000"/>
+          <w:sz w:val="24"/>
+        </w:rPr>
+        <w:t>Option 2 的推理目标是达到 Option 1 的 3--4 倍吞吐。这个数值是工程目标，不作为未测试的固定结论。项目启动前需要分别测试 16 卡、32 卡和 64 卡的端到端速度。</w:t>
+      </w:r>
+    </w:p>
+    <w:p>
+      <w:r>
+        <w:rPr>
+          <w:rFonts w:ascii="Times New Roman" w:hAnsi="Times New Roman" w:cs="Times New Roman" w:eastAsia="宋体"/>
+          <w:color w:val="000000"/>
+          <w:sz w:val="24"/>
+        </w:rPr>
+        <w:t>Option 2 可以减少训练和导出算力，但不能减少最终嵌入的存储量。8 期全国 2 米、64 维 int8 产品仍需要保存约 1.229 PB 净数据。</w:t>
+      </w:r>
+    </w:p>
+    <w:p>
+      <w:r>
+        <w:rPr>
+          <w:rFonts w:ascii="Times New Roman" w:hAnsi="Times New Roman" w:cs="Times New Roman" w:eastAsia="宋体"/>
+          <w:color w:val="000000"/>
+          <w:sz w:val="24"/>
+        </w:rPr>
+        <w:t>Option 2 的主要取舍是，小型地物的边界可以达到 2 米，但大部分语义来自 10 米主干。正式采用前，先选择城市、农业、山区和海岸四类区域，与 Option 1 小规模模型使用同一套建筑、道路、水体、土地覆盖和检索任务比较。Option 2 的主要指标下降不超过 2%时，再用于全国生产。</w:t>
+      </w:r>
+    </w:p>
+    <w:p>
+      <w:r>
+        <w:rPr>
+          <w:rFonts w:ascii="Times New Roman" w:hAnsi="Times New Roman" w:cs="Times New Roman" w:eastAsia="宋体"/>
+          <w:color w:val="000000"/>
+          <w:sz w:val="24"/>
+        </w:rPr>
+        <w:t>公开方法参考如下。</w:t>
+      </w:r>
+    </w:p>
+    <w:p>
+      <w:r>
+        <w:rPr>
+          <w:rFonts w:ascii="Times New Roman" w:hAnsi="Times New Roman" w:cs="Times New Roman" w:eastAsia="宋体"/>
+          <w:color w:val="000000"/>
+          <w:sz w:val="24"/>
+        </w:rPr>
+        <w:t>1、</w:t>
+      </w:r>
+      <w:hyperlink r:id="rId10">
+        <w:r>
+          <w:rPr>
+            <w:rFonts w:ascii="Times New Roman" w:hAnsi="Times New Roman" w:eastAsia="宋体"/>
+            <w:color w:val="000000"/>
+            <w:u w:val="none"/>
+            <w:sz w:val="24"/>
+          </w:rPr>
+          <w:t>RS-vHeat</w:t>
+        </w:r>
+      </w:hyperlink>
+      <w:r>
+        <w:rPr>
+          <w:rFonts w:ascii="Times New Roman" w:hAnsi="Times New Roman" w:cs="Times New Roman" w:eastAsia="宋体"/>
+          <w:color w:val="000000"/>
+          <w:sz w:val="24"/>
+        </w:rPr>
+        <w:t xml:space="preserve"> 使用高效算子处理高分辨率遥感影像，论文报告相对注意力模型提高约 2.7 倍吞吐。</w:t>
+      </w:r>
+    </w:p>
+    <w:p>
+      <w:r>
+        <w:rPr>
+          <w:rFonts w:ascii="Times New Roman" w:hAnsi="Times New Roman" w:cs="Times New Roman" w:eastAsia="宋体"/>
+          <w:color w:val="000000"/>
+          <w:sz w:val="24"/>
+        </w:rPr>
+        <w:t>2、</w:t>
+      </w:r>
+      <w:hyperlink r:id="rId11">
+        <w:r>
+          <w:rPr>
+            <w:rFonts w:ascii="Times New Roman" w:hAnsi="Times New Roman" w:eastAsia="宋体"/>
+            <w:color w:val="000000"/>
+            <w:u w:val="none"/>
+            <w:sz w:val="24"/>
+          </w:rPr>
+          <w:t>FlexiMo</w:t>
+        </w:r>
+      </w:hyperlink>
+      <w:r>
+        <w:rPr>
+          <w:rFonts w:ascii="Times New Roman" w:hAnsi="Times New Roman" w:cs="Times New Roman" w:eastAsia="宋体"/>
+          <w:color w:val="000000"/>
+          <w:sz w:val="24"/>
+        </w:rPr>
+        <w:t xml:space="preserve"> 使用分辨率感知和轻量通道适配模块处理不同空间分辨率数据。</w:t>
+      </w:r>
+    </w:p>
+    <w:p>
+      <w:r>
+        <w:rPr>
+          <w:rFonts w:ascii="Times New Roman" w:hAnsi="Times New Roman" w:cs="Times New Roman" w:eastAsia="宋体"/>
+          <w:color w:val="000000"/>
+          <w:sz w:val="24"/>
+        </w:rPr>
+        <w:t>3、</w:t>
+      </w:r>
+      <w:hyperlink r:id="rId12">
+        <w:r>
+          <w:rPr>
+            <w:rFonts w:ascii="Times New Roman" w:hAnsi="Times New Roman" w:eastAsia="宋体"/>
+            <w:color w:val="000000"/>
+            <w:u w:val="none"/>
+            <w:sz w:val="24"/>
+          </w:rPr>
+          <w:t>Channel-Wise Knowledge Distillation for Dense Prediction</w:t>
+        </w:r>
+      </w:hyperlink>
+      <w:r>
+        <w:rPr>
+          <w:rFonts w:ascii="Times New Roman" w:hAnsi="Times New Roman" w:cs="Times New Roman" w:eastAsia="宋体"/>
+          <w:color w:val="000000"/>
+          <w:sz w:val="24"/>
+        </w:rPr>
+        <w:t xml:space="preserve"> 说明轻量学生模型可以通过稠密预测蒸馏继承教师模型的空间语义。</w:t>
+      </w:r>
+    </w:p>
+    <w:p>
+      <w:r>
+        <w:rPr>
+          <w:rFonts w:ascii="Times New Roman" w:hAnsi="Times New Roman" w:cs="Times New Roman" w:eastAsia="宋体"/>
+          <w:color w:val="000000"/>
+          <w:sz w:val="24"/>
+        </w:rPr>
+        <w:t>4、</w:t>
+      </w:r>
+      <w:hyperlink r:id="rId13">
+        <w:r>
+          <w:rPr>
+            <w:rFonts w:ascii="Times New Roman" w:hAnsi="Times New Roman" w:eastAsia="宋体"/>
+            <w:color w:val="000000"/>
+            <w:u w:val="none"/>
+            <w:sz w:val="24"/>
+          </w:rPr>
+          <w:t>SegFormer</w:t>
+        </w:r>
+      </w:hyperlink>
+      <w:r>
+        <w:rPr>
+          <w:rFonts w:ascii="Times New Roman" w:hAnsi="Times New Roman" w:cs="Times New Roman" w:eastAsia="宋体"/>
+          <w:color w:val="000000"/>
+          <w:sz w:val="24"/>
+        </w:rPr>
+        <w:t xml:space="preserve"> 使用多尺度编码和轻量 MLP 解码器降低稠密预测计算量。</w:t>
+      </w:r>
+    </w:p>
+    <w:p>
+      <w:pPr>
+        <w:pStyle w:val="Heading2"/>
+        <w:jc w:val="left"/>
+      </w:pPr>
+      <w:r>
+        <w:rPr>
+          <w:rFonts w:ascii="Times New Roman" w:hAnsi="Times New Roman" w:cs="Times New Roman" w:eastAsia="宋体"/>
+          <w:b/>
+          <w:color w:val="000000"/>
+          <w:sz w:val="28"/>
+        </w:rPr>
+        <w:t>3. 磁盘存储</w:t>
       </w:r>
     </w:p>
     <w:p>
@@ -1374,7 +2236,7 @@
           <w:color w:val="000000"/>
           <w:sz w:val="28"/>
         </w:rPr>
-        <w:t>3. 交付时间</w:t>
+        <w:t>4. 交付时间</w:t>
       </w:r>
     </w:p>
     <w:tbl>
@@ -1386,13 +2248,14 @@
         <w:tblLook w:firstColumn="1" w:firstRow="1" w:lastColumn="0" w:lastRow="0" w:noHBand="0" w:noVBand="1" w:val="04A0"/>
       </w:tblPr>
       <w:tblGrid>
-        <w:gridCol w:w="4929"/>
-        <w:gridCol w:w="4929"/>
+        <w:gridCol w:w="3286"/>
+        <w:gridCol w:w="3286"/>
+        <w:gridCol w:w="3286"/>
       </w:tblGrid>
       <w:tr>
         <w:tc>
           <w:tcPr>
-            <w:tcW w:type="dxa" w:w="4929"/>
+            <w:tcW w:type="dxa" w:w="3286"/>
             <w:vAlign w:val="center"/>
           </w:tcPr>
           <w:p>
@@ -1420,7 +2283,7 @@
         </w:tc>
         <w:tc>
           <w:tcPr>
-            <w:tcW w:type="dxa" w:w="4929"/>
+            <w:tcW w:type="dxa" w:w="3286"/>
             <w:vAlign w:val="center"/>
           </w:tcPr>
           <w:p>
@@ -1442,7 +2305,35 @@
                 <w:color w:val="000000"/>
                 <w:sz w:val="24"/>
               </w:rPr>
-              <w:t>预计时间</w:t>
+              <w:t>Option 1</w:t>
+            </w:r>
+          </w:p>
+        </w:tc>
+        <w:tc>
+          <w:tcPr>
+            <w:tcW w:type="dxa" w:w="3286"/>
+            <w:vAlign w:val="center"/>
+          </w:tcPr>
+          <w:p>
+            <w:pPr>
+              <w:jc w:val="center"/>
+            </w:pPr>
+            <w:r>
+              <w:rPr>
+                <w:rFonts w:ascii="Times New Roman" w:hAnsi="Times New Roman" w:cs="Times New Roman" w:eastAsia="宋体"/>
+                <w:b/>
+                <w:color w:val="000000"/>
+                <w:sz w:val="24"/>
+              </w:rPr>
+            </w:r>
+            <w:r>
+              <w:rPr>
+                <w:rFonts w:ascii="Times New Roman" w:hAnsi="Times New Roman" w:cs="Times New Roman" w:eastAsia="宋体"/>
+                <w:b/>
+                <w:color w:val="000000"/>
+                <w:sz w:val="24"/>
+              </w:rPr>
+              <w:t>Option 2</w:t>
             </w:r>
           </w:p>
         </w:tc>
@@ -1450,7 +2341,7 @@
       <w:tr>
         <w:tc>
           <w:tcPr>
-            <w:tcW w:type="dxa" w:w="4929"/>
+            <w:tcW w:type="dxa" w:w="3286"/>
             <w:vAlign w:val="center"/>
           </w:tcPr>
           <w:p>
@@ -1476,7 +2367,7 @@
         </w:tc>
         <w:tc>
           <w:tcPr>
-            <w:tcW w:type="dxa" w:w="4929"/>
+            <w:tcW w:type="dxa" w:w="3286"/>
             <w:vAlign w:val="center"/>
           </w:tcPr>
           <w:p>
@@ -1500,11 +2391,9 @@
             </w:r>
           </w:p>
         </w:tc>
-      </w:tr>
-      <w:tr>
         <w:tc>
           <w:tcPr>
-            <w:tcW w:type="dxa" w:w="4929"/>
+            <w:tcW w:type="dxa" w:w="3286"/>
             <w:vAlign w:val="center"/>
           </w:tcPr>
           <w:p>
@@ -1524,13 +2413,15 @@
                 <w:color w:val="000000"/>
                 <w:sz w:val="24"/>
               </w:rPr>
-              <w:t>2,000 点试运行、云掩膜和配准检查</w:t>
+              <w:t>15--20 天</w:t>
             </w:r>
           </w:p>
         </w:tc>
+      </w:tr>
+      <w:tr>
         <w:tc>
           <w:tcPr>
-            <w:tcW w:type="dxa" w:w="4929"/>
+            <w:tcW w:type="dxa" w:w="3286"/>
             <w:vAlign w:val="center"/>
           </w:tcPr>
           <w:p>
@@ -1550,6 +2441,58 @@
                 <w:color w:val="000000"/>
                 <w:sz w:val="24"/>
               </w:rPr>
+              <w:t>2,000 点试运行、云掩膜和配准检查</w:t>
+            </w:r>
+          </w:p>
+        </w:tc>
+        <w:tc>
+          <w:tcPr>
+            <w:tcW w:type="dxa" w:w="3286"/>
+            <w:vAlign w:val="center"/>
+          </w:tcPr>
+          <w:p>
+            <w:pPr>
+              <w:jc w:val="center"/>
+            </w:pPr>
+            <w:r>
+              <w:rPr>
+                <w:rFonts w:ascii="Times New Roman" w:hAnsi="Times New Roman" w:cs="Times New Roman" w:eastAsia="宋体"/>
+                <w:color w:val="000000"/>
+                <w:sz w:val="24"/>
+              </w:rPr>
+            </w:r>
+            <w:r>
+              <w:rPr>
+                <w:rFonts w:ascii="Times New Roman" w:hAnsi="Times New Roman" w:cs="Times New Roman" w:eastAsia="宋体"/>
+                <w:color w:val="000000"/>
+                <w:sz w:val="24"/>
+              </w:rPr>
+              <w:t>12--15 天</w:t>
+            </w:r>
+          </w:p>
+        </w:tc>
+        <w:tc>
+          <w:tcPr>
+            <w:tcW w:type="dxa" w:w="3286"/>
+            <w:vAlign w:val="center"/>
+          </w:tcPr>
+          <w:p>
+            <w:pPr>
+              <w:jc w:val="center"/>
+            </w:pPr>
+            <w:r>
+              <w:rPr>
+                <w:rFonts w:ascii="Times New Roman" w:hAnsi="Times New Roman" w:cs="Times New Roman" w:eastAsia="宋体"/>
+                <w:color w:val="000000"/>
+                <w:sz w:val="24"/>
+              </w:rPr>
+            </w:r>
+            <w:r>
+              <w:rPr>
+                <w:rFonts w:ascii="Times New Roman" w:hAnsi="Times New Roman" w:cs="Times New Roman" w:eastAsia="宋体"/>
+                <w:color w:val="000000"/>
+                <w:sz w:val="24"/>
+              </w:rPr>
               <w:t>12--15 天</w:t>
             </w:r>
           </w:p>
@@ -1558,7 +2501,7 @@
       <w:tr>
         <w:tc>
           <w:tcPr>
-            <w:tcW w:type="dxa" w:w="4929"/>
+            <w:tcW w:type="dxa" w:w="3286"/>
             <w:vAlign w:val="center"/>
           </w:tcPr>
           <w:p>
@@ -1578,13 +2521,13 @@
                 <w:color w:val="000000"/>
                 <w:sz w:val="24"/>
               </w:rPr>
-              <w:t>16/32/64 卡性能测试</w:t>
+              <w:t>多卡性能测试</w:t>
             </w:r>
           </w:p>
         </w:tc>
         <w:tc>
           <w:tcPr>
-            <w:tcW w:type="dxa" w:w="4929"/>
+            <w:tcW w:type="dxa" w:w="3286"/>
             <w:vAlign w:val="center"/>
           </w:tcPr>
           <w:p>
@@ -1608,11 +2551,9 @@
             </w:r>
           </w:p>
         </w:tc>
-      </w:tr>
-      <w:tr>
         <w:tc>
           <w:tcPr>
-            <w:tcW w:type="dxa" w:w="4929"/>
+            <w:tcW w:type="dxa" w:w="3286"/>
             <w:vAlign w:val="center"/>
           </w:tcPr>
           <w:p>
@@ -1632,13 +2573,15 @@
                 <w:color w:val="000000"/>
                 <w:sz w:val="24"/>
               </w:rPr>
-              <w:t>384--512 卡正式训练</w:t>
+              <w:t>7--10 天</w:t>
             </w:r>
           </w:p>
         </w:tc>
+      </w:tr>
+      <w:tr>
         <w:tc>
           <w:tcPr>
-            <w:tcW w:type="dxa" w:w="4929"/>
+            <w:tcW w:type="dxa" w:w="3286"/>
             <w:vAlign w:val="center"/>
           </w:tcPr>
           <w:p>
@@ -1658,7 +2601,59 @@
                 <w:color w:val="000000"/>
                 <w:sz w:val="24"/>
               </w:rPr>
+              <w:t>正式训练</w:t>
+            </w:r>
+          </w:p>
+        </w:tc>
+        <w:tc>
+          <w:tcPr>
+            <w:tcW w:type="dxa" w:w="3286"/>
+            <w:vAlign w:val="center"/>
+          </w:tcPr>
+          <w:p>
+            <w:pPr>
+              <w:jc w:val="center"/>
+            </w:pPr>
+            <w:r>
+              <w:rPr>
+                <w:rFonts w:ascii="Times New Roman" w:hAnsi="Times New Roman" w:cs="Times New Roman" w:eastAsia="宋体"/>
+                <w:color w:val="000000"/>
+                <w:sz w:val="24"/>
+              </w:rPr>
+            </w:r>
+            <w:r>
+              <w:rPr>
+                <w:rFonts w:ascii="Times New Roman" w:hAnsi="Times New Roman" w:cs="Times New Roman" w:eastAsia="宋体"/>
+                <w:color w:val="000000"/>
+                <w:sz w:val="24"/>
+              </w:rPr>
               <w:t>55--75 天</w:t>
+            </w:r>
+          </w:p>
+        </w:tc>
+        <w:tc>
+          <w:tcPr>
+            <w:tcW w:type="dxa" w:w="3286"/>
+            <w:vAlign w:val="center"/>
+          </w:tcPr>
+          <w:p>
+            <w:pPr>
+              <w:jc w:val="center"/>
+            </w:pPr>
+            <w:r>
+              <w:rPr>
+                <w:rFonts w:ascii="Times New Roman" w:hAnsi="Times New Roman" w:cs="Times New Roman" w:eastAsia="宋体"/>
+                <w:color w:val="000000"/>
+                <w:sz w:val="24"/>
+              </w:rPr>
+            </w:r>
+            <w:r>
+              <w:rPr>
+                <w:rFonts w:ascii="Times New Roman" w:hAnsi="Times New Roman" w:cs="Times New Roman" w:eastAsia="宋体"/>
+                <w:color w:val="000000"/>
+                <w:sz w:val="24"/>
+              </w:rPr>
+              <w:t>25--35 天</w:t>
             </w:r>
           </w:p>
         </w:tc>
@@ -1666,7 +2661,7 @@
       <w:tr>
         <w:tc>
           <w:tcPr>
-            <w:tcW w:type="dxa" w:w="4929"/>
+            <w:tcW w:type="dxa" w:w="3286"/>
             <w:vAlign w:val="center"/>
           </w:tcPr>
           <w:p>
@@ -1692,7 +2687,7 @@
         </w:tc>
         <w:tc>
           <w:tcPr>
-            <w:tcW w:type="dxa" w:w="4929"/>
+            <w:tcW w:type="dxa" w:w="3286"/>
             <w:vAlign w:val="center"/>
           </w:tcPr>
           <w:p>
@@ -1716,11 +2711,9 @@
             </w:r>
           </w:p>
         </w:tc>
-      </w:tr>
-      <w:tr>
         <w:tc>
           <w:tcPr>
-            <w:tcW w:type="dxa" w:w="4929"/>
+            <w:tcW w:type="dxa" w:w="3286"/>
             <w:vAlign w:val="center"/>
           </w:tcPr>
           <w:p>
@@ -1740,13 +2733,15 @@
                 <w:color w:val="000000"/>
                 <w:sz w:val="24"/>
               </w:rPr>
-              <w:t>下游测试、补片和验收</w:t>
+              <w:t>25--35 天</w:t>
             </w:r>
           </w:p>
         </w:tc>
+      </w:tr>
+      <w:tr>
         <w:tc>
           <w:tcPr>
-            <w:tcW w:type="dxa" w:w="4929"/>
+            <w:tcW w:type="dxa" w:w="3286"/>
             <w:vAlign w:val="center"/>
           </w:tcPr>
           <w:p>
@@ -1766,6 +2761,58 @@
                 <w:color w:val="000000"/>
                 <w:sz w:val="24"/>
               </w:rPr>
+              <w:t>下游测试、补片和验收</w:t>
+            </w:r>
+          </w:p>
+        </w:tc>
+        <w:tc>
+          <w:tcPr>
+            <w:tcW w:type="dxa" w:w="3286"/>
+            <w:vAlign w:val="center"/>
+          </w:tcPr>
+          <w:p>
+            <w:pPr>
+              <w:jc w:val="center"/>
+            </w:pPr>
+            <w:r>
+              <w:rPr>
+                <w:rFonts w:ascii="Times New Roman" w:hAnsi="Times New Roman" w:cs="Times New Roman" w:eastAsia="宋体"/>
+                <w:color w:val="000000"/>
+                <w:sz w:val="24"/>
+              </w:rPr>
+            </w:r>
+            <w:r>
+              <w:rPr>
+                <w:rFonts w:ascii="Times New Roman" w:hAnsi="Times New Roman" w:cs="Times New Roman" w:eastAsia="宋体"/>
+                <w:color w:val="000000"/>
+                <w:sz w:val="24"/>
+              </w:rPr>
+              <w:t>15--20 天</w:t>
+            </w:r>
+          </w:p>
+        </w:tc>
+        <w:tc>
+          <w:tcPr>
+            <w:tcW w:type="dxa" w:w="3286"/>
+            <w:vAlign w:val="center"/>
+          </w:tcPr>
+          <w:p>
+            <w:pPr>
+              <w:jc w:val="center"/>
+            </w:pPr>
+            <w:r>
+              <w:rPr>
+                <w:rFonts w:ascii="Times New Roman" w:hAnsi="Times New Roman" w:cs="Times New Roman" w:eastAsia="宋体"/>
+                <w:color w:val="000000"/>
+                <w:sz w:val="24"/>
+              </w:rPr>
+            </w:r>
+            <w:r>
+              <w:rPr>
+                <w:rFonts w:ascii="Times New Roman" w:hAnsi="Times New Roman" w:cs="Times New Roman" w:eastAsia="宋体"/>
+                <w:color w:val="000000"/>
+                <w:sz w:val="24"/>
+              </w:rPr>
               <w:t>15--20 天</w:t>
             </w:r>
           </w:p>
@@ -1774,7 +2821,7 @@
       <w:tr>
         <w:tc>
           <w:tcPr>
-            <w:tcW w:type="dxa" w:w="4929"/>
+            <w:tcW w:type="dxa" w:w="3286"/>
             <w:vAlign w:val="center"/>
           </w:tcPr>
           <w:p>
@@ -1800,7 +2847,7 @@
         </w:tc>
         <w:tc>
           <w:tcPr>
-            <w:tcW w:type="dxa" w:w="4929"/>
+            <w:tcW w:type="dxa" w:w="3286"/>
             <w:vAlign w:val="center"/>
           </w:tcPr>
           <w:p>
@@ -1824,11 +2871,9 @@
             </w:r>
           </w:p>
         </w:tc>
-      </w:tr>
-      <w:tr>
         <w:tc>
           <w:tcPr>
-            <w:tcW w:type="dxa" w:w="4929"/>
+            <w:tcW w:type="dxa" w:w="3286"/>
             <w:vAlign w:val="center"/>
           </w:tcPr>
           <w:p>
@@ -1848,13 +2893,15 @@
                 <w:color w:val="000000"/>
                 <w:sz w:val="24"/>
               </w:rPr>
-              <w:t>项目总工期</w:t>
+              <w:t>10--15 天</w:t>
             </w:r>
           </w:p>
         </w:tc>
+      </w:tr>
+      <w:tr>
         <w:tc>
           <w:tcPr>
-            <w:tcW w:type="dxa" w:w="4929"/>
+            <w:tcW w:type="dxa" w:w="3286"/>
             <w:vAlign w:val="center"/>
           </w:tcPr>
           <w:p>
@@ -1874,7 +2921,59 @@
                 <w:color w:val="000000"/>
                 <w:sz w:val="24"/>
               </w:rPr>
+              <w:t>项目总工期</w:t>
+            </w:r>
+          </w:p>
+        </w:tc>
+        <w:tc>
+          <w:tcPr>
+            <w:tcW w:type="dxa" w:w="3286"/>
+            <w:vAlign w:val="center"/>
+          </w:tcPr>
+          <w:p>
+            <w:pPr>
+              <w:jc w:val="center"/>
+            </w:pPr>
+            <w:r>
+              <w:rPr>
+                <w:rFonts w:ascii="Times New Roman" w:hAnsi="Times New Roman" w:cs="Times New Roman" w:eastAsia="宋体"/>
+                <w:color w:val="000000"/>
+                <w:sz w:val="24"/>
+              </w:rPr>
+            </w:r>
+            <w:r>
+              <w:rPr>
+                <w:rFonts w:ascii="Times New Roman" w:hAnsi="Times New Roman" w:cs="Times New Roman" w:eastAsia="宋体"/>
+                <w:color w:val="000000"/>
+                <w:sz w:val="24"/>
+              </w:rPr>
               <w:t>约 120--150 天</w:t>
+            </w:r>
+          </w:p>
+        </w:tc>
+        <w:tc>
+          <w:tcPr>
+            <w:tcW w:type="dxa" w:w="3286"/>
+            <w:vAlign w:val="center"/>
+          </w:tcPr>
+          <w:p>
+            <w:pPr>
+              <w:jc w:val="center"/>
+            </w:pPr>
+            <w:r>
+              <w:rPr>
+                <w:rFonts w:ascii="Times New Roman" w:hAnsi="Times New Roman" w:cs="Times New Roman" w:eastAsia="宋体"/>
+                <w:color w:val="000000"/>
+                <w:sz w:val="24"/>
+              </w:rPr>
+            </w:r>
+            <w:r>
+              <w:rPr>
+                <w:rFonts w:ascii="Times New Roman" w:hAnsi="Times New Roman" w:cs="Times New Roman" w:eastAsia="宋体"/>
+                <w:color w:val="000000"/>
+                <w:sz w:val="24"/>
+              </w:rPr>
+              <w:t>约 90--120 天</w:t>
             </w:r>
           </w:p>
         </w:tc>
@@ -1892,7 +2991,7 @@
           <w:color w:val="000000"/>
           <w:sz w:val="24"/>
         </w:rPr>
-        <w:t>上述工期允许训练后半程与已完成区域的嵌入导出并行。如果高分数据不能按季度提供、存储低于 2 PB 或算力低于 320 张 910B，不安排全国 2 米版本的交付时间。</w:t>
+        <w:t>上述工期允许训练后半程与已完成区域的嵌入导出并行。如果高分数据不能按季度提供或存储低于 2 PB，不安排全国 2 米版本的交付时间。Option 1 的算力低于 320 张、Option 2 的算力低于 64 张时，也不安排对应方案的全国交付时间。</w:t>
       </w:r>
     </w:p>
     <w:p>
@@ -3173,7 +4272,7 @@
         </w:rPr>
         <w:t>1、</w:t>
       </w:r>
-      <w:hyperlink r:id="rId10">
+      <w:hyperlink r:id="rId14">
         <w:r>
           <w:rPr>
             <w:rFonts w:ascii="Times New Roman" w:hAnsi="Times New Roman" w:eastAsia="宋体"/>
@@ -3194,7 +4293,7 @@
         </w:rPr>
         <w:t>2、</w:t>
       </w:r>
-      <w:hyperlink r:id="rId11">
+      <w:hyperlink r:id="rId15">
         <w:r>
           <w:rPr>
             <w:rFonts w:ascii="Times New Roman" w:hAnsi="Times New Roman" w:eastAsia="宋体"/>
@@ -3215,7 +4314,7 @@
         </w:rPr>
         <w:t>3、</w:t>
       </w:r>
-      <w:hyperlink r:id="rId12">
+      <w:hyperlink r:id="rId16">
         <w:r>
           <w:rPr>
             <w:rFonts w:ascii="Times New Roman" w:hAnsi="Times New Roman" w:eastAsia="宋体"/>
@@ -3236,7 +4335,7 @@
         </w:rPr>
         <w:t>4、</w:t>
       </w:r>
-      <w:hyperlink r:id="rId13">
+      <w:hyperlink r:id="rId17">
         <w:r>
           <w:rPr>
             <w:rFonts w:ascii="Times New Roman" w:hAnsi="Times New Roman" w:eastAsia="宋体"/>
@@ -3257,7 +4356,7 @@
         </w:rPr>
         <w:t>5、</w:t>
       </w:r>
-      <w:hyperlink r:id="rId14">
+      <w:hyperlink r:id="rId18">
         <w:r>
           <w:rPr>
             <w:rFonts w:ascii="Times New Roman" w:hAnsi="Times New Roman" w:eastAsia="宋体"/>
@@ -3562,7 +4661,7 @@
                 <w:sz w:val="24"/>
               </w:rPr>
             </w:r>
-            <w:hyperlink r:id="rId15">
+            <w:hyperlink r:id="rId19">
               <w:r>
                 <w:rPr>
                   <w:rFonts w:ascii="Times New Roman" w:hAnsi="Times New Roman" w:eastAsia="宋体"/>
@@ -3697,7 +4796,7 @@
                 <w:sz w:val="24"/>
               </w:rPr>
             </w:r>
-            <w:hyperlink r:id="rId15">
+            <w:hyperlink r:id="rId19">
               <w:r>
                 <w:rPr>
                   <w:rFonts w:ascii="Times New Roman" w:hAnsi="Times New Roman" w:eastAsia="宋体"/>
@@ -3832,7 +4931,7 @@
                 <w:sz w:val="24"/>
               </w:rPr>
             </w:r>
-            <w:hyperlink r:id="rId16">
+            <w:hyperlink r:id="rId20">
               <w:r>
                 <w:rPr>
                   <w:rFonts w:ascii="Times New Roman" w:hAnsi="Times New Roman" w:eastAsia="宋体"/>
@@ -3967,7 +5066,7 @@
                 <w:sz w:val="24"/>
               </w:rPr>
             </w:r>
-            <w:hyperlink r:id="rId17">
+            <w:hyperlink r:id="rId21">
               <w:r>
                 <w:rPr>
                   <w:rFonts w:ascii="Times New Roman" w:hAnsi="Times New Roman" w:eastAsia="宋体"/>
@@ -4102,7 +5201,7 @@
                 <w:sz w:val="24"/>
               </w:rPr>
             </w:r>
-            <w:hyperlink r:id="rId18">
+            <w:hyperlink r:id="rId22">
               <w:r>
                 <w:rPr>
                   <w:rFonts w:ascii="Times New Roman" w:hAnsi="Times New Roman" w:eastAsia="宋体"/>
@@ -4237,7 +5336,7 @@
                 <w:sz w:val="24"/>
               </w:rPr>
             </w:r>
-            <w:hyperlink r:id="rId19">
+            <w:hyperlink r:id="rId23">
               <w:r>
                 <w:rPr>
                   <w:rFonts w:ascii="Times New Roman" w:hAnsi="Times New Roman" w:eastAsia="宋体"/>
@@ -4372,7 +5471,7 @@
                 <w:sz w:val="24"/>
               </w:rPr>
             </w:r>
-            <w:hyperlink r:id="rId20">
+            <w:hyperlink r:id="rId24">
               <w:r>
                 <w:rPr>
                   <w:rFonts w:ascii="Times New Roman" w:hAnsi="Times New Roman" w:eastAsia="宋体"/>
@@ -4507,7 +5606,7 @@
                 <w:sz w:val="24"/>
               </w:rPr>
             </w:r>
-            <w:hyperlink r:id="rId21">
+            <w:hyperlink r:id="rId25">
               <w:r>
                 <w:rPr>
                   <w:rFonts w:ascii="Times New Roman" w:hAnsi="Times New Roman" w:eastAsia="宋体"/>
@@ -4642,7 +5741,7 @@
                 <w:sz w:val="24"/>
               </w:rPr>
             </w:r>
-            <w:hyperlink r:id="rId22">
+            <w:hyperlink r:id="rId26">
               <w:r>
                 <w:rPr>
                   <w:rFonts w:ascii="Times New Roman" w:hAnsi="Times New Roman" w:eastAsia="宋体"/>
@@ -4777,7 +5876,7 @@
                 <w:sz w:val="24"/>
               </w:rPr>
             </w:r>
-            <w:hyperlink r:id="rId23">
+            <w:hyperlink r:id="rId27">
               <w:r>
                 <w:rPr>
                   <w:rFonts w:ascii="Times New Roman" w:hAnsi="Times New Roman" w:eastAsia="宋体"/>
@@ -4912,7 +6011,7 @@
                 <w:sz w:val="24"/>
               </w:rPr>
             </w:r>
-            <w:hyperlink r:id="rId24">
+            <w:hyperlink r:id="rId28">
               <w:r>
                 <w:rPr>
                   <w:rFonts w:ascii="Times New Roman" w:hAnsi="Times New Roman" w:eastAsia="宋体"/>
@@ -5047,7 +6146,7 @@
                 <w:sz w:val="24"/>
               </w:rPr>
             </w:r>
-            <w:hyperlink r:id="rId25">
+            <w:hyperlink r:id="rId29">
               <w:r>
                 <w:rPr>
                   <w:rFonts w:ascii="Times New Roman" w:hAnsi="Times New Roman" w:eastAsia="宋体"/>
@@ -5182,7 +6281,7 @@
                 <w:sz w:val="24"/>
               </w:rPr>
             </w:r>
-            <w:hyperlink r:id="rId26">
+            <w:hyperlink r:id="rId30">
               <w:r>
                 <w:rPr>
                   <w:rFonts w:ascii="Times New Roman" w:hAnsi="Times New Roman" w:eastAsia="宋体"/>
@@ -6146,7 +7245,7 @@
           <w:color w:val="000000"/>
           <w:sz w:val="24"/>
         </w:rPr>
-        <w:t>硬件支持：LZ 项目至少提供 320 张 Ascend 910B，建议提供 384--512 张，并提供 2--3 PB 在线存储。</w:t>
+        <w:t>硬件支持：Option 1 至少提供 320 张 Ascend 910B，建议提供 384--512 张；Option 2 至少提供 64 张，建议提供 96--128 张。两个方案都需要 2--3 PB 在线存储。</w:t>
       </w:r>
     </w:p>
     <w:p>
@@ -6221,7 +7320,7 @@
           <w:color w:val="000000"/>
           <w:sz w:val="24"/>
         </w:rPr>
-        <w:t>3、Ascend 910B 不少于 320 张，建议达到 384--512 张。</w:t>
+        <w:t>3、Option 1 的 Ascend 910B 不少于 320 张；Option 2 不少于 64 张。</w:t>
       </w:r>
     </w:p>
     <w:p>
@@ -6376,7 +7475,7 @@
                     <pic:cNvPicPr/>
                   </pic:nvPicPr>
                   <pic:blipFill>
-                    <a:blip r:embed="rId27"/>
+                    <a:blip r:embed="rId31"/>
                     <a:stretch>
                       <a:fillRect/>
                     </a:stretch>

</xml_diff>